<commit_message>
Expand librarian workflow documentation
Document the complete in-person librarian workflow for client registration, loans, returns, borrower identification and fines.
</commit_message>
<xml_diff>
--- a/Documentacion_Biblioteca_ArquiSoft.docx
+++ b/Documentacion_Biblioteca_ArquiSoft.docx
@@ -3659,6 +3659,697 @@
         <w:t>El registro público crea usuarios con rol estudiante. El rol cajero existe en el modelo y puede operar multas cuando se cree una cuenta con ese rol desde un seeder o administración interna.</w:t>
       </w:r>
     </w:p>
+    <w:p>
+      <w:r>
+        <w:br w:type="page"/>
+      </w:r>
+    </w:p>
+    <w:p>
+      <w:pPr>
+        <w:pStyle w:val="Heading1"/>
+      </w:pPr>
+      <w:r>
+        <w:t>Manual operativo del bibliotecario</w:t>
+      </w:r>
+    </w:p>
+    <w:p>
+      <w:r>
+        <w:t>Este manual explica el flujo presencial: el cliente llega a la biblioteca y el bibliotecario registra el préstamo, devolución o multa desde el sistema web.</w:t>
+      </w:r>
+    </w:p>
+    <w:p>
+      <w:pPr>
+        <w:pStyle w:val="Heading2"/>
+      </w:pPr>
+      <w:r>
+        <w:t>1. Ingresar como bibliotecario</w:t>
+      </w:r>
+    </w:p>
+    <w:p>
+      <w:pPr>
+        <w:pStyle w:val="ListNumber"/>
+      </w:pPr>
+      <w:r>
+        <w:t>Abrir http://127.0.0.1:8000/login.</w:t>
+      </w:r>
+    </w:p>
+    <w:p>
+      <w:pPr>
+        <w:pStyle w:val="ListNumber"/>
+      </w:pPr>
+      <w:r>
+        <w:t>Ingresar correo bibliotecario@arquisoft.test.</w:t>
+      </w:r>
+    </w:p>
+    <w:p>
+      <w:pPr>
+        <w:pStyle w:val="ListNumber"/>
+      </w:pPr>
+      <w:r>
+        <w:t>Ingresar contraseña biblio12345.</w:t>
+      </w:r>
+    </w:p>
+    <w:p>
+      <w:pPr>
+        <w:pStyle w:val="ListNumber"/>
+      </w:pPr>
+      <w:r>
+        <w:t>Presionar Ingresar.</w:t>
+      </w:r>
+    </w:p>
+    <w:p>
+      <w:r>
+        <w:t>El rol bibliotecario permite consultar clientes, registrar préstamos presenciales y registrar devoluciones. No debe compartirse esta cuenta en producción.</w:t>
+      </w:r>
+    </w:p>
+    <w:p>
+      <w:pPr>
+        <w:pStyle w:val="Heading2"/>
+      </w:pPr>
+      <w:r>
+        <w:t>2. Registrar un cliente nuevo</w:t>
+      </w:r>
+    </w:p>
+    <w:p>
+      <w:pPr>
+        <w:pStyle w:val="ListNumber"/>
+      </w:pPr>
+      <w:r>
+        <w:t>Abrir Gestionar clientes o entrar a http://127.0.0.1:8000/gestion/clientes.</w:t>
+      </w:r>
+    </w:p>
+    <w:p>
+      <w:pPr>
+        <w:pStyle w:val="ListNumber"/>
+      </w:pPr>
+      <w:r>
+        <w:t>Abrir el panel Registrar nuevo cliente.</w:t>
+      </w:r>
+    </w:p>
+    <w:p>
+      <w:pPr>
+        <w:pStyle w:val="ListNumber"/>
+      </w:pPr>
+      <w:r>
+        <w:t>Ingresar nombre completo y correo electrónico del cliente.</w:t>
+      </w:r>
+    </w:p>
+    <w:p>
+      <w:pPr>
+        <w:pStyle w:val="ListNumber"/>
+      </w:pPr>
+      <w:r>
+        <w:t>Presionar Guardar cliente y continuar.</w:t>
+      </w:r>
+    </w:p>
+    <w:p>
+      <w:pPr>
+        <w:pStyle w:val="ListNumber"/>
+      </w:pPr>
+      <w:r>
+        <w:t>El sistema crea una cuenta de estudiante y muestra el historial del cliente seleccionado.</w:t>
+      </w:r>
+    </w:p>
+    <w:p>
+      <w:r>
+        <w:t>El correo funciona como dato único. Si ya existe, se debe buscar al cliente en lugar de crear otra cuenta.</w:t>
+      </w:r>
+    </w:p>
+    <w:p>
+      <w:pPr>
+        <w:pStyle w:val="Heading2"/>
+      </w:pPr>
+      <w:r>
+        <w:t>3. Registrar un préstamo presencial</w:t>
+      </w:r>
+    </w:p>
+    <w:p>
+      <w:pPr>
+        <w:pStyle w:val="ListNumber"/>
+      </w:pPr>
+      <w:r>
+        <w:t>Buscar al cliente por nombre o correo.</w:t>
+      </w:r>
+    </w:p>
+    <w:p>
+      <w:pPr>
+        <w:pStyle w:val="ListNumber"/>
+      </w:pPr>
+      <w:r>
+        <w:t>Seleccionar al cliente correcto y comprobar su nombre, correo e ID.</w:t>
+      </w:r>
+    </w:p>
+    <w:p>
+      <w:pPr>
+        <w:pStyle w:val="ListNumber"/>
+      </w:pPr>
+      <w:r>
+        <w:t>Revisar sus multas pendientes y préstamos activos.</w:t>
+      </w:r>
+    </w:p>
+    <w:p>
+      <w:pPr>
+        <w:pStyle w:val="ListNumber"/>
+      </w:pPr>
+      <w:r>
+        <w:t>En Nuevo préstamo presencial, seleccionar un libro disponible.</w:t>
+      </w:r>
+    </w:p>
+    <w:p>
+      <w:pPr>
+        <w:pStyle w:val="ListNumber"/>
+      </w:pPr>
+      <w:r>
+        <w:t>Presionar Registrar préstamo.</w:t>
+      </w:r>
+    </w:p>
+    <w:p>
+      <w:pPr>
+        <w:pStyle w:val="ListNumber"/>
+      </w:pPr>
+      <w:r>
+        <w:t>Confirmar que el libro aparezca en el historial del cliente y que disminuya la disponibilidad.</w:t>
+      </w:r>
+    </w:p>
+    <w:p>
+      <w:r>
+        <w:t>El préstamo guarda user_id, libro_id, fecha de préstamo, fecha de vencimiento y estado activo. El cliente nunca se confunde con el bibliotecario porque el préstamo pertenece al user_id seleccionado.</w:t>
+      </w:r>
+    </w:p>
+    <w:p>
+      <w:pPr>
+        <w:pStyle w:val="Heading2"/>
+      </w:pPr>
+      <w:r>
+        <w:t>4. Registrar un préstamo desde Solicitar préstamo</w:t>
+      </w:r>
+    </w:p>
+    <w:p>
+      <w:r>
+        <w:t>También se puede iniciar desde Catálogo &gt; Detalle del libro &gt; Solicitar préstamo. El sistema abre un modal para ingresar nombre y correo. Si el bibliotecario está autenticado, esos datos se utilizan para asignar el préstamo al cliente indicado, no al bibliotecario.</w:t>
+      </w:r>
+    </w:p>
+    <w:p>
+      <w:pPr>
+        <w:pStyle w:val="ListNumber"/>
+      </w:pPr>
+      <w:r>
+        <w:t>Seleccionar el libro en el catálogo.</w:t>
+      </w:r>
+    </w:p>
+    <w:p>
+      <w:pPr>
+        <w:pStyle w:val="ListNumber"/>
+      </w:pPr>
+      <w:r>
+        <w:t>Presionar Solicitar préstamo.</w:t>
+      </w:r>
+    </w:p>
+    <w:p>
+      <w:pPr>
+        <w:pStyle w:val="ListNumber"/>
+      </w:pPr>
+      <w:r>
+        <w:t>Ingresar los datos del cliente en el modal.</w:t>
+      </w:r>
+    </w:p>
+    <w:p>
+      <w:pPr>
+        <w:pStyle w:val="ListNumber"/>
+      </w:pPr>
+      <w:r>
+        <w:t>Seleccionar el medio de pago y continuar.</w:t>
+      </w:r>
+    </w:p>
+    <w:p>
+      <w:pPr>
+        <w:pStyle w:val="ListNumber"/>
+      </w:pPr>
+      <w:r>
+        <w:t>Revisar el modal de confirmación interbancaria.</w:t>
+      </w:r>
+    </w:p>
+    <w:p>
+      <w:pPr>
+        <w:pStyle w:val="ListNumber"/>
+      </w:pPr>
+      <w:r>
+        <w:t>Presionar Confirmar y registrar pago.</w:t>
+      </w:r>
+    </w:p>
+    <w:p>
+      <w:pPr>
+        <w:pStyle w:val="Heading2"/>
+      </w:pPr>
+      <w:r>
+        <w:t>5. Ver todos los préstamos y saber a quién pertenece cada libro</w:t>
+      </w:r>
+    </w:p>
+    <w:p>
+      <w:pPr>
+        <w:pStyle w:val="ListNumber"/>
+      </w:pPr>
+      <w:r>
+        <w:t>Abrir Préstamos registrados o http://127.0.0.1:8000/gestion/prestamos.</w:t>
+      </w:r>
+    </w:p>
+    <w:p>
+      <w:pPr>
+        <w:pStyle w:val="ListNumber"/>
+      </w:pPr>
+      <w:r>
+        <w:t>Usar el buscador por nombre o correo.</w:t>
+      </w:r>
+    </w:p>
+    <w:p>
+      <w:pPr>
+        <w:pStyle w:val="ListNumber"/>
+      </w:pPr>
+      <w:r>
+        <w:t>Filtrar por Activos o Devueltos si es necesario.</w:t>
+      </w:r>
+    </w:p>
+    <w:p>
+      <w:pPr>
+        <w:pStyle w:val="ListNumber"/>
+      </w:pPr>
+      <w:r>
+        <w:t>Leer en cada fila el cliente, correo, ID, libro, fecha, vencimiento y estado.</w:t>
+      </w:r>
+    </w:p>
+    <w:p>
+      <w:r>
+        <w:t>Esta vista es la más importante para el control diario. Mis préstamos es una vista personal del usuario autenticado; Préstamos registrados es la vista global del personal.</w:t>
+      </w:r>
+    </w:p>
+    <w:p>
+      <w:pPr>
+        <w:pStyle w:val="Heading2"/>
+      </w:pPr>
+      <w:r>
+        <w:t>6. Registrar una devolución</w:t>
+      </w:r>
+    </w:p>
+    <w:p>
+      <w:pPr>
+        <w:pStyle w:val="ListNumber"/>
+      </w:pPr>
+      <w:r>
+        <w:t>Localizar el préstamo en Préstamos registrados o en el historial del cliente.</w:t>
+      </w:r>
+    </w:p>
+    <w:p>
+      <w:pPr>
+        <w:pStyle w:val="ListNumber"/>
+      </w:pPr>
+      <w:r>
+        <w:t>Verificar que el libro devuelto coincida con el cliente.</w:t>
+      </w:r>
+    </w:p>
+    <w:p>
+      <w:pPr>
+        <w:pStyle w:val="ListNumber"/>
+      </w:pPr>
+      <w:r>
+        <w:t>Presionar Devolver o Registrar devolución.</w:t>
+      </w:r>
+    </w:p>
+    <w:p>
+      <w:pPr>
+        <w:pStyle w:val="ListNumber"/>
+      </w:pPr>
+      <w:r>
+        <w:t>El sistema cambia el estado a devuelto y aumenta los ejemplares disponibles.</w:t>
+      </w:r>
+    </w:p>
+    <w:p>
+      <w:pPr>
+        <w:pStyle w:val="ListNumber"/>
+      </w:pPr>
+      <w:r>
+        <w:t>Si la fecha supera el vencimiento, el sistema crea una multa pendiente automáticamente.</w:t>
+      </w:r>
+    </w:p>
+    <w:p>
+      <w:pPr>
+        <w:pStyle w:val="ListNumber"/>
+      </w:pPr>
+      <w:r>
+        <w:t>Revisar el mensaje de devolución registrada y la posible multa.</w:t>
+      </w:r>
+    </w:p>
+    <w:p>
+      <w:pPr>
+        <w:pStyle w:val="Heading2"/>
+      </w:pPr>
+      <w:r>
+        <w:t>7. Gestionar una multa</w:t>
+      </w:r>
+    </w:p>
+    <w:p>
+      <w:pPr>
+        <w:pStyle w:val="ListNumber"/>
+      </w:pPr>
+      <w:r>
+        <w:t>Abrir el historial del cliente o Mis multas.</w:t>
+      </w:r>
+    </w:p>
+    <w:p>
+      <w:pPr>
+        <w:pStyle w:val="ListNumber"/>
+      </w:pPr>
+      <w:r>
+        <w:t>Identificar el préstamo que originó la multa.</w:t>
+      </w:r>
+    </w:p>
+    <w:p>
+      <w:pPr>
+        <w:pStyle w:val="ListNumber"/>
+      </w:pPr>
+      <w:r>
+        <w:t>Informar al cliente el monto y los días de atraso.</w:t>
+      </w:r>
+    </w:p>
+    <w:p>
+      <w:pPr>
+        <w:pStyle w:val="ListNumber"/>
+      </w:pPr>
+      <w:r>
+        <w:t>Seleccionar Tarjeta, Yape o Plin.</w:t>
+      </w:r>
+    </w:p>
+    <w:p>
+      <w:pPr>
+        <w:pStyle w:val="ListNumber"/>
+      </w:pPr>
+      <w:r>
+        <w:t>Confirmar el pago.</w:t>
+      </w:r>
+    </w:p>
+    <w:p>
+      <w:pPr>
+        <w:pStyle w:val="ListNumber"/>
+      </w:pPr>
+      <w:r>
+        <w:t>Verificar que la multa cambie de pendiente a pagada.</w:t>
+      </w:r>
+    </w:p>
+    <w:p>
+      <w:r>
+        <w:t>El registro de pago conserva la multa, el préstamo, el monto, el método, la referencia y el estado. No se guarda el número completo de la tarjeta.</w:t>
+      </w:r>
+    </w:p>
+    <w:p>
+      <w:pPr>
+        <w:pStyle w:val="Heading2"/>
+      </w:pPr>
+      <w:r>
+        <w:t>8. Cómo se diferencian varios clientes</w:t>
+      </w:r>
+    </w:p>
+    <w:tbl>
+      <w:tblPr>
+        <w:tblStyle w:val="TableGrid"/>
+        <w:tblW w:type="auto" w:w="0"/>
+        <w:tblLook w:firstColumn="1" w:firstRow="1" w:lastColumn="0" w:lastRow="0" w:noHBand="0" w:noVBand="1" w:val="04A0"/>
+      </w:tblPr>
+      <w:tblGrid>
+        <w:gridCol w:w="2484"/>
+        <w:gridCol w:w="2484"/>
+        <w:gridCol w:w="2484"/>
+        <w:gridCol w:w="2484"/>
+      </w:tblGrid>
+      <w:tr>
+        <w:tc>
+          <w:tcPr>
+            <w:tcW w:type="dxa" w:w="2484"/>
+            <w:shd w:fill="173F5F"/>
+          </w:tcPr>
+          <w:p>
+            <w:r>
+              <w:rPr>
+                <w:b/>
+                <w:color w:val="FFFFFF"/>
+              </w:rPr>
+              <w:t>Cliente</w:t>
+            </w:r>
+          </w:p>
+        </w:tc>
+        <w:tc>
+          <w:tcPr>
+            <w:tcW w:type="dxa" w:w="2484"/>
+            <w:shd w:fill="173F5F"/>
+          </w:tcPr>
+          <w:p>
+            <w:r>
+              <w:rPr>
+                <w:b/>
+                <w:color w:val="FFFFFF"/>
+              </w:rPr>
+              <w:t>Identificación</w:t>
+            </w:r>
+          </w:p>
+        </w:tc>
+        <w:tc>
+          <w:tcPr>
+            <w:tcW w:type="dxa" w:w="2484"/>
+            <w:shd w:fill="173F5F"/>
+          </w:tcPr>
+          <w:p>
+            <w:r>
+              <w:rPr>
+                <w:b/>
+                <w:color w:val="FFFFFF"/>
+              </w:rPr>
+              <w:t>Préstamo</w:t>
+            </w:r>
+          </w:p>
+        </w:tc>
+        <w:tc>
+          <w:tcPr>
+            <w:tcW w:type="dxa" w:w="2484"/>
+            <w:shd w:fill="173F5F"/>
+          </w:tcPr>
+          <w:p>
+            <w:r>
+              <w:rPr>
+                <w:b/>
+                <w:color w:val="FFFFFF"/>
+              </w:rPr>
+              <w:t>Resultado</w:t>
+            </w:r>
+          </w:p>
+        </w:tc>
+      </w:tr>
+      <w:tr>
+        <w:tc>
+          <w:tcPr>
+            <w:tcW w:type="dxa" w:w="2484"/>
+          </w:tcPr>
+          <w:p>
+            <w:r>
+              <w:t>Ana Pérez</w:t>
+            </w:r>
+          </w:p>
+        </w:tc>
+        <w:tc>
+          <w:tcPr>
+            <w:tcW w:type="dxa" w:w="2484"/>
+          </w:tcPr>
+          <w:p>
+            <w:r>
+              <w:t>ID #8 / ana@example.com</w:t>
+            </w:r>
+          </w:p>
+        </w:tc>
+        <w:tc>
+          <w:tcPr>
+            <w:tcW w:type="dxa" w:w="2484"/>
+          </w:tcPr>
+          <w:p>
+            <w:r>
+              <w:t>Libro A</w:t>
+            </w:r>
+          </w:p>
+        </w:tc>
+        <w:tc>
+          <w:tcPr>
+            <w:tcW w:type="dxa" w:w="2484"/>
+          </w:tcPr>
+          <w:p>
+            <w:r>
+              <w:t>Préstamo asociado a user_id 8</w:t>
+            </w:r>
+          </w:p>
+        </w:tc>
+      </w:tr>
+      <w:tr>
+        <w:tc>
+          <w:tcPr>
+            <w:tcW w:type="dxa" w:w="2484"/>
+          </w:tcPr>
+          <w:p>
+            <w:r>
+              <w:t>Juan López</w:t>
+            </w:r>
+          </w:p>
+        </w:tc>
+        <w:tc>
+          <w:tcPr>
+            <w:tcW w:type="dxa" w:w="2484"/>
+          </w:tcPr>
+          <w:p>
+            <w:r>
+              <w:t>ID #12 / juan@example.com</w:t>
+            </w:r>
+          </w:p>
+        </w:tc>
+        <w:tc>
+          <w:tcPr>
+            <w:tcW w:type="dxa" w:w="2484"/>
+          </w:tcPr>
+          <w:p>
+            <w:r>
+              <w:t>Libro A</w:t>
+            </w:r>
+          </w:p>
+        </w:tc>
+        <w:tc>
+          <w:tcPr>
+            <w:tcW w:type="dxa" w:w="2484"/>
+          </w:tcPr>
+          <w:p>
+            <w:r>
+              <w:t>Préstamo asociado a user_id 12</w:t>
+            </w:r>
+          </w:p>
+        </w:tc>
+      </w:tr>
+      <w:tr>
+        <w:tc>
+          <w:tcPr>
+            <w:tcW w:type="dxa" w:w="2484"/>
+          </w:tcPr>
+          <w:p>
+            <w:r>
+              <w:t>Ana Pérez</w:t>
+            </w:r>
+          </w:p>
+        </w:tc>
+        <w:tc>
+          <w:tcPr>
+            <w:tcW w:type="dxa" w:w="2484"/>
+          </w:tcPr>
+          <w:p>
+            <w:r>
+              <w:t>ID #8 / ana@example.com</w:t>
+            </w:r>
+          </w:p>
+        </w:tc>
+        <w:tc>
+          <w:tcPr>
+            <w:tcW w:type="dxa" w:w="2484"/>
+          </w:tcPr>
+          <w:p>
+            <w:r>
+              <w:t>Libro B</w:t>
+            </w:r>
+          </w:p>
+        </w:tc>
+        <w:tc>
+          <w:tcPr>
+            <w:tcW w:type="dxa" w:w="2484"/>
+          </w:tcPr>
+          <w:p>
+            <w:r>
+              <w:t>Segundo préstamo de la misma persona</w:t>
+            </w:r>
+          </w:p>
+        </w:tc>
+      </w:tr>
+    </w:tbl>
+    <w:p>
+      <w:r>
+        <w:t>Cada préstamo también tiene un ID propio. Por eso dos clientes pueden pedir el mismo libro y una persona puede tener varios préstamos sin mezclar historiales.</w:t>
+      </w:r>
+    </w:p>
+    <w:p>
+      <w:pPr>
+        <w:pStyle w:val="Heading2"/>
+      </w:pPr>
+      <w:r>
+        <w:t>9. Reglas que debe revisar el bibliotecario</w:t>
+      </w:r>
+    </w:p>
+    <w:p>
+      <w:pPr>
+        <w:pStyle w:val="ListBullet"/>
+      </w:pPr>
+      <w:r>
+        <w:t>No crear un cliente duplicado: buscar primero por correo.</w:t>
+      </w:r>
+    </w:p>
+    <w:p>
+      <w:pPr>
+        <w:pStyle w:val="ListBullet"/>
+      </w:pPr>
+      <w:r>
+        <w:t>Confirmar nombre, correo e ID antes de registrar.</w:t>
+      </w:r>
+    </w:p>
+    <w:p>
+      <w:pPr>
+        <w:pStyle w:val="ListBullet"/>
+      </w:pPr>
+      <w:r>
+        <w:t>No prestar un libro agotado.</w:t>
+      </w:r>
+    </w:p>
+    <w:p>
+      <w:pPr>
+        <w:pStyle w:val="ListBullet"/>
+      </w:pPr>
+      <w:r>
+        <w:t>Revisar multas pendientes antes de crear otro préstamo.</w:t>
+      </w:r>
+    </w:p>
+    <w:p>
+      <w:pPr>
+        <w:pStyle w:val="ListBullet"/>
+      </w:pPr>
+      <w:r>
+        <w:t>Usar Préstamos registrados para saber quién tiene cada libro.</w:t>
+      </w:r>
+    </w:p>
+    <w:p>
+      <w:pPr>
+        <w:pStyle w:val="ListBullet"/>
+      </w:pPr>
+      <w:r>
+        <w:t>Registrar la devolución inmediatamente cuando el libro sea entregado.</w:t>
+      </w:r>
+    </w:p>
+    <w:p>
+      <w:pPr>
+        <w:pStyle w:val="ListBullet"/>
+      </w:pPr>
+      <w:r>
+        <w:t>No compartir las credenciales demo en un entorno real.</w:t>
+      </w:r>
+    </w:p>
+    <w:p>
+      <w:pPr>
+        <w:pStyle w:val="Heading2"/>
+      </w:pPr>
+      <w:r>
+        <w:t>10. Flujo resumido</w:t>
+      </w:r>
+    </w:p>
+    <w:p>
+      <w:r>
+        <w:t>Cliente presencial -&gt; Bibliotecario inicia sesión -&gt; Busca o registra cliente -&gt; Selecciona libro -&gt; Registra préstamo -&gt; Sistema descuenta ejemplar -&gt; Cliente devuelve -&gt; Bibliotecario registra devolución -&gt; Sistema calcula multa si hay atraso -&gt; Cliente paga multa -&gt; Sistema actualiza historial.</w:t>
+      </w:r>
+    </w:p>
     <w:sectPr>
       <w:footerReference w:type="default" r:id="rId9"/>
       <w:pgSz w:w="12240" w:h="15840"/>

</xml_diff>